<commit_message>
JIRA LANSA-504 Docker Change Powershell prompt so its clear a terminal is in a container. Consolidate licensing. Stop installing curl - now VL runtime is using 64-bit native curl.exe. Update Docker doc
</commit_message>
<xml_diff>
--- a/Docker/LANSA Docker Image creation and Usage Instructions.docx
+++ b/Docker/LANSA Docker Image creation and Usage Instructions.docx
@@ -614,7 +614,7 @@
     </w:p>
     <w:p>
       <w:r>
-        <w:t xml:space="preserve">If an additional DLL must be added after the MSI install, there are two supported approaches.</w:t>
+        <w:t xml:space="preserve">If an additional DLL must be added after the MSI install, there are two supported approaches. And you should consider re-building the MSI and then re-building the application Docker image.</w:t>
       </w:r>
     </w:p>
     <w:p>
@@ -836,6 +836,14 @@
       </w:r>
     </w:p>
     <w:p>
+      <w:pPr>
+        <w:ind w:left="360"/>
+      </w:pPr>
+      <w:r>
+        <w:t xml:space="preserve">• Its a very fast process so it may as well be used every time you need to patch.</w:t>
+      </w:r>
+    </w:p>
+    <w:p>
       <w:r>
         <w:t xml:space="preserve"/>
       </w:r>
@@ -870,7 +878,7 @@
     </w:p>
     <w:p>
       <w:r>
-        <w:t xml:space="preserve">run_img.ps1 can be run without database parameters if the database server has not changed. In that case, pass -ByPassSQLServerDNSChecks so bootstrap.ps1 skips DNS and ODBC validation.</w:t>
+        <w:t xml:space="preserve">run_img.ps1 can be run without database parameters if the database server has not changed. In that case, pass -ByPassSQLServerDNSChecks so bootstrap.ps1 skips DNS and ODBC validation. But note that stopping a Cloud VM and restarting it may change the VM IP Address and if your database is on the container host the ODBC DSN needs to be modified. run_img.ps1 obtains the current IP address and passes it to bootstrap.ps1 to modify the ODBC DSN. It also is quite quick, so its recommended to always run without -ByPassSQLServerDNSChecks.</w:t>
       </w:r>
     </w:p>
     <w:p>

</xml_diff>

<commit_message>
JIRA LANSA-504  Docker generate docx from md using a POSH script.
</commit_message>
<xml_diff>
--- a/Docker/LANSA Docker Image creation and Usage Instructions.docx
+++ b/Docker/LANSA Docker Image creation and Usage Instructions.docx
@@ -1,6 +1,6 @@
 
 <file path=word\document.xml><?xml version="1.0" encoding="utf-8"?>
-<w:document xmlns:wpc="http://schemas.microsoft.com/office/word/2010/wordprocessingCanvas" xmlns:mc="http://schemas.openxmlformats.org/markup-compatibility/2006" xmlns:o="urn:schemas-microsoft-com:office:office" xmlns:r="http://schemas.openxmlformats.org/officeDocument/2006/relationships" xmlns:m="http://schemas.openxmlformats.org/officeDocument/2006/math" xmlns:v="urn:schemas-microsoft-com:vml" xmlns:wp14="http://schemas.microsoft.com/office/word/2010/wordprocessingDrawing" xmlns:wp="http://schemas.openxmlformats.org/drawingml/2006/wordprocessingDrawing" xmlns:w10="urn:schemas-microsoft-com:office:word" xmlns:w="http://schemas.openxmlformats.org/wordprocessingml/2006/main" xmlns:w14="http://schemas.microsoft.com/office/word/2010/wordml" xmlns:w15="http://schemas.microsoft.com/office/word/2012/wordml" xmlns:w16cex="http://schemas.microsoft.com/office/word/2018/wordml/cex" xmlns:w16cid="http://schemas.microsoft.com/office/word/2016/wordml/cid" xmlns:w16="http://schemas.microsoft.com/office/word/2018/wordml" xmlns:w16du="http://schemas.microsoft.com/office/word/2023/wordml/word16du" xmlns:w16sdtdh="http://schemas.microsoft.com/office/word/2020/wordml/sdtdatahash" xmlns:w16sdtfl="http://schemas.microsoft.com/office/word/2024/wordml/sdtformatlock" xmlns:w16se="http://schemas.microsoft.com/office/word/2015/wordml/symex" xmlns:wpg="http://schemas.microsoft.com/office/word/2010/wordprocessingGroup" xmlns:wpi="http://schemas.microsoft.com/office/word/2010/wordprocessingInk" xmlns:wne="http://schemas.microsoft.com/office/word/2006/wordml" xmlns:wps="http://schemas.microsoft.com/office/word/2010/wordprocessingShape" mc:Ignorable="w14 w15 w16se w16cid w16 w16cex w16sdtdh w16sdtfl w16du wp14">
+<w:document xmlns:wpc="http://schemas.microsoft.com/office/word/2010/wordprocessingCanvas" xmlns:mc="http://schemas.openxmlformats.org/markup-compatibility/2006" xmlns:o="urn:schemas-microsoft-com:office:office" xmlns:r="http://schemas.openxmlformats.org/officeDocument/2006/relationships" xmlns:m="http://schemas.openxmlformats.org/officeDocument/2006/math" xmlns:v="urn:schemas-microsoft-com:vml" xmlns:wp14="http://schemas.microsoft.com/office/word/2010/wordprocessingDrawing" xmlns:wp="http://schemas.openxmlformats.org/drawingml/2006/wordprocessingDrawing" xmlns:w10="urn:schemas-microsoft-com:office:word" xmlns:w="http://schemas.openxmlformats.org/wordprocessingml/2006/main" xmlns:w14="http://schemas.microsoft.com/office/word/2010/wordml" xmlns:w15="http://schemas.microsoft.com/office/word/2012/wordml" xmlns:w16cex="http://schemas.microsoft.com/office/word/2018/wordml/cex" xmlns:w16cid="http://schemas.microsoft.com/office/word/2016/wordml/cid" xmlns:w16="http://schemas.microsoft.com/office/word/2018/wordml" xmlns:w16du="http://schemas.microsoft.com/office/word/2023/wordml/word16du" xmlns:w16sdtdh="http://schemas.microsoft.com/office/word/2020/wordml/sdtdatahash" xmlns:w16sdtfl="http://schemas.microsoft.com/office/word/2024/wordml/sdtformatlock" xmlns:w16se="http://schemas.microsoft.com/office/word/2015/wordml/symex" xmlns:wpg="http://schemas.microsoft.com/office/word/2010/wordprocessingGroup" xmlns:wpi="http://schemas.microsoft.com/office/word/2010/wordprocessingInk" xmlns:wne="http://schemas.microsoft.com/office/word/2006/wordml" xmlns:wps="http://schemas.microsoft.com/office/word/2010/wordprocessingShape" xmlns:a="http://schemas.openxmlformats.org/drawingml/2006/main" xmlns:pic="http://schemas.openxmlformats.org/drawingml/2006/picture" mc:Ignorable="w14 w15 w16se w16cid w16 w16cex w16sdtdh w16sdtfl w16du wp14">
   <w:body>
     <w:p>
       <w:pPr>
@@ -555,6 +555,9 @@
       </w:r>
     </w:p>
     <w:p>
+      <w:pPr>
+        <w:ind w:left="360"/>
+      </w:pPr>
       <w:r>
         <w:rPr>
           <w:rFonts w:ascii="Consolas" w:hAnsi="Consolas"/>
@@ -581,6 +584,9 @@
       </w:r>
     </w:p>
     <w:p>
+      <w:pPr>
+        <w:ind w:left="360"/>
+      </w:pPr>
       <w:r>
         <w:rPr>
           <w:rFonts w:ascii="Consolas" w:hAnsi="Consolas"/>
@@ -761,6 +767,9 @@
       </w:r>
     </w:p>
     <w:p>
+      <w:pPr>
+        <w:ind w:left="360"/>
+      </w:pPr>
       <w:r>
         <w:rPr>
           <w:rFonts w:ascii="Consolas" w:hAnsi="Consolas"/>
@@ -790,6 +799,9 @@
       </w:r>
     </w:p>
     <w:p>
+      <w:pPr>
+        <w:ind w:left="360"/>
+      </w:pPr>
       <w:r>
         <w:rPr>
           <w:rFonts w:ascii="Consolas" w:hAnsi="Consolas"/>
@@ -846,6 +858,9 @@
       </w:r>
     </w:p>
     <w:p>
+      <w:pPr>
+        <w:ind w:left="360"/>
+      </w:pPr>
       <w:r>
         <w:rPr>
           <w:rFonts w:ascii="Consolas" w:hAnsi="Consolas"/>
@@ -875,6 +890,9 @@
       </w:r>
     </w:p>
     <w:p>
+      <w:pPr>
+        <w:ind w:left="360"/>
+      </w:pPr>
       <w:r>
         <w:rPr>
           <w:rFonts w:ascii="Consolas" w:hAnsi="Consolas"/>
@@ -904,6 +922,9 @@
       </w:r>
     </w:p>
     <w:p>
+      <w:pPr>
+        <w:ind w:left="360"/>
+      </w:pPr>
       <w:r>
         <w:rPr>
           <w:rFonts w:ascii="Consolas" w:hAnsi="Consolas"/>
@@ -951,6 +972,9 @@
       </w:r>
     </w:p>
     <w:p>
+      <w:pPr>
+        <w:ind w:left="360"/>
+      </w:pPr>
       <w:r>
         <w:rPr>
           <w:rFonts w:ascii="Consolas" w:hAnsi="Consolas"/>
@@ -998,6 +1022,9 @@
       </w:r>
     </w:p>
     <w:p>
+      <w:pPr>
+        <w:ind w:left="360"/>
+      </w:pPr>
       <w:r>
         <w:rPr>
           <w:rFonts w:ascii="Consolas" w:hAnsi="Consolas"/>
@@ -1054,6 +1081,9 @@
       </w:r>
     </w:p>
     <w:p>
+      <w:pPr>
+        <w:ind w:left="360"/>
+      </w:pPr>
       <w:r>
         <w:rPr>
           <w:rFonts w:ascii="Consolas" w:hAnsi="Consolas"/>
@@ -1063,6 +1093,9 @@
       </w:r>
     </w:p>
     <w:p>
+      <w:pPr>
+        <w:ind w:left="360"/>
+      </w:pPr>
       <w:r>
         <w:rPr>
           <w:rFonts w:ascii="Consolas" w:hAnsi="Consolas"/>
@@ -1104,6 +1137,65 @@
         <w:t xml:space="preserve">• If a Powershell command window is opened inside the container, the Powershell prompt will display 'Cont C:\&gt;' instead of the standard 'PS C:\&gt;' to clearly show its in the container.</w:t>
       </w:r>
     </w:p>
+    <w:p/>
+    <w:p>
+      <w:pPr>
+        <w:pStyle w:val="Heading1"/>
+      </w:pPr>
+      <w:r>
+        <w:t xml:space="preserve">Example Image Tags</w:t>
+      </w:r>
+    </w:p>
+    <w:p/>
+    <w:p>
+      <w:r>
+        <w:t xml:space="preserve">The following example shows immutable and floating tags for the AWAMAPP and Base images.</w:t>
+      </w:r>
+    </w:p>
+    <w:p/>
+    <w:p>
+      <w:pPr>
+        <w:jc w:val="center"/>
+      </w:pPr>
+      <w:r>
+        <w:drawing>
+          <wp:inline distT="0" distB="0" distL="0" distR="0">
+            <wp:extent cx="5943600" cy="3343275"/>
+            <wp:effectExtent l="0" t="0" r="0" b="0"/>
+            <wp:docPr id="1" name="image1.png" descr="Example Docker image tags"/>
+            <wp:cNvGraphicFramePr>
+              <a:graphicFrameLocks noChangeAspect="1"/>
+            </wp:cNvGraphicFramePr>
+            <a:graphic>
+              <a:graphicData uri="http://schemas.openxmlformats.org/drawingml/2006/picture">
+                <pic:pic>
+                  <pic:nvPicPr>
+                    <pic:cNvPr id="0" name="image1.png" descr="Example Docker image tags"/>
+                    <pic:cNvPicPr/>
+                  </pic:nvPicPr>
+                  <pic:blipFill>
+                    <a:blip r:embed="rId2"/>
+                    <a:stretch>
+                      <a:fillRect/>
+                    </a:stretch>
+                  </pic:blipFill>
+                  <pic:spPr>
+                    <a:xfrm>
+                      <a:off x="0" y="0"/>
+                      <a:ext cx="5943600" cy="3343275"/>
+                    </a:xfrm>
+                    <a:prstGeom prst="rect">
+                      <a:avLst/>
+                    </a:prstGeom>
+                  </pic:spPr>
+                </pic:pic>
+              </a:graphicData>
+            </a:graphic>
+          </wp:inline>
+        </w:drawing>
+      </w:r>
+    </w:p>
+    <w:p/>
     <w:sectPr>
       <w:pgSz w:w="12240" w:h="15840"/>
       <w:pgMar w:top="1440" w:right="1440" w:bottom="1440" w:left="1440" w:header="720" w:footer="720" w:gutter="0"/>

</xml_diff>

<commit_message>
JIRA LANSA-504 Update docs
</commit_message>
<xml_diff>
--- a/Docker/LANSA Docker Image creation and Usage Instructions.docx
+++ b/Docker/LANSA Docker Image creation and Usage Instructions.docx
@@ -10,7 +10,6 @@
         <w:t xml:space="preserve">LANSA Docker Image Creation and Usage Instructions</w:t>
       </w:r>
     </w:p>
-    <w:p/>
     <w:p>
       <w:pPr>
         <w:pStyle w:val="Heading1"/>
@@ -21,34 +20,100 @@
     </w:p>
     <w:p>
       <w:r>
-        <w:t xml:space="preserve">Repository: git@github.com:robe070/cookbooks.git (sub-directory: Docker). Branch: debug/paas.</w:t>
-      </w:r>
-    </w:p>
-    <w:p/>
-    <w:p>
-      <w:r>
-        <w:t xml:space="preserve">Base image is published to Docker Hub. The AWAMAPP example image is not published.</w:t>
-      </w:r>
-    </w:p>
-    <w:p/>
-    <w:p>
-      <w:r>
-        <w:t xml:space="preserve">The base image includes only the prerequisites to install and run LANSA.</w:t>
-      </w:r>
-    </w:p>
-    <w:p/>
+        <w:t xml:space="preserve">The code is in the GitHub Repository: git@github.com:robe070/cookbooks.git (sub-directory: Docker). Branch: debug/paas.</w:t>
+      </w:r>
+    </w:p>
+    <w:p>
+      <w:r>
+        <w:t xml:space="preserve">I have published a Visual LANSA runtime base image to Docker Hub. The AWAMAPP example image is not published. The base image includes only the prerequisites to install and run LANSA.</w:t>
+      </w:r>
+    </w:p>
+    <w:p>
+      <w:r>
+        <w:rPr>
+          <w:b/>
+        </w:rPr>
+        <w:t xml:space="preserve">lansalpc/vlbase-servercore</w:t>
+      </w:r>
+    </w:p>
+    <w:p>
+      <w:r>
+        <w:rPr>
+          <w:b/>
+        </w:rPr>
+        <w:t xml:space="preserve">Tags</w:t>
+      </w:r>
+    </w:p>
+    <w:p>
+      <w:r>
+        <w:t xml:space="preserve">16.0.0-ltsc2025 (Immutable)</w:t>
+      </w:r>
+    </w:p>
+    <w:p>
+      <w:r>
+        <w:t xml:space="preserve">v16ga-ltsc2025 (Floating)</w:t>
+      </w:r>
+    </w:p>
+    <w:p>
+      <w:r>
+        <w:t xml:space="preserve">15.0.0-ltsc2025 (Immutable)</w:t>
+      </w:r>
+    </w:p>
+    <w:p>
+      <w:r>
+        <w:t xml:space="preserve">v15ga-ltsc2025 (Floating)</w:t>
+      </w:r>
+    </w:p>
+    <w:p>
+      <w:r>
+        <w:t xml:space="preserve">This image is essentially the same as the images we publish in AWS and Azure Marketplace. To run a Visual LANSA app you need to deploy a VL MSI into the image.</w:t>
+      </w:r>
+    </w:p>
+    <w:p>
+      <w:r>
+        <w:t xml:space="preserve">All the code to assemble the base image and to deploy a VL MSI into the image and construct an image of that is published here: https://github.com/robe070/cookbooks/tree/debug/paas/Docker</w:t>
+      </w:r>
+    </w:p>
     <w:p>
       <w:r>
         <w:t xml:space="preserve">The AWAMAPP example demonstrates installing a LANSA MSI into the base container.</w:t>
       </w:r>
     </w:p>
-    <w:p/>
     <w:p>
       <w:r>
         <w:t xml:space="preserve">Database state is integral to the MSI installation. The resulting image and database must match.</w:t>
       </w:r>
     </w:p>
-    <w:p/>
+    <w:p>
+      <w:r>
+        <w:t xml:space="preserve">IMAGE-NAMING.md describes the image naming structure.</w:t>
+      </w:r>
+    </w:p>
+    <w:p>
+      <w:r>
+        <w:t xml:space="preserve">LANSA Docker Image creation and Usage Instructions.md is the user guide. (This file)</w:t>
+      </w:r>
+    </w:p>
+    <w:p>
+      <w:r>
+        <w:t xml:space="preserve">You will need to install Hot Fix EPC160000HF_260417 for V16 and Hot Fix ****** for V15 and construct an MSI to deploy into the Docker image. These Hot Fixes enable Cloud Account Id licensing in a Docker image for both AWS and Azure. I have tested both. Scripts in the above github repo require a Cloud type to be supplied when constructing the application image.</w:t>
+      </w:r>
+    </w:p>
+    <w:p>
+      <w:r>
+        <w:t xml:space="preserve">Infrastructure creation like load balancers has not been provided.</w:t>
+      </w:r>
+    </w:p>
+    <w:p>
+      <w:r>
+        <w:t xml:space="preserve">N.B. Docker Host must match the image pretty closely. You will need the latest version of Windows Server 2025. This is a Windows on Docker restriction. Nothing to do with LANSA.</w:t>
+      </w:r>
+    </w:p>
+    <w:p>
+      <w:r>
+        <w:t xml:space="preserve">It also means that constructing a Visual LANSA base image for another version of Windows requires setting up a new VM running that version.</w:t>
+      </w:r>
+    </w:p>
     <w:p>
       <w:pPr>
         <w:pStyle w:val="Heading1"/>
@@ -59,16 +124,14 @@
     </w:p>
     <w:p>
       <w:r>
-        <w:t xml:space="preserve">Obtain a Cloud Account Id license for either AWS or Azure and place the x_lic*.lic file in the application root directory (e.g., AWAMAPP).</w:t>
-      </w:r>
-    </w:p>
-    <w:p/>
-    <w:p>
-      <w:r>
-        <w:t xml:space="preserve">The file is copied into the LANSA licensing directory during installation.</w:t>
-      </w:r>
-    </w:p>
-    <w:p/>
+        <w:t xml:space="preserve">Obtain a Cloud Account Id license for either AWS or Azure, add it to the x_lic*.lic file using the "Licensing - Server Licenses" application int the development environment Settings &amp; Administration folder and place the x_lic*.lic file in the application root directory (e.g. AWAMAPP). Multiple license files may be added so that the Docker image you create may be used in both your AWS and Azure accounts, and also support multiple accounts and multiple regions if thats necessary.</w:t>
+      </w:r>
+    </w:p>
+    <w:p>
+      <w:r>
+        <w:t xml:space="preserve">The license files are copied into the LANSA licensing directory during installation.</w:t>
+      </w:r>
+    </w:p>
     <w:p>
       <w:r>
         <w:t xml:space="preserve">Instructions for obtaining the Cloud Account Id license:</w:t>
@@ -79,7 +142,6 @@
         <w:t xml:space="preserve">https://docs.lansa.com/16/en/lansa041/content/lansa/l4winsba_0055.htm</w:t>
       </w:r>
     </w:p>
-    <w:p/>
     <w:p>
       <w:pPr>
         <w:pStyle w:val="Heading1"/>
@@ -93,25 +155,21 @@
         <w:t xml:space="preserve">Base image repository: lansalpc/vlbase-servercore</w:t>
       </w:r>
     </w:p>
-    <w:p/>
     <w:p>
       <w:r>
         <w:t xml:space="preserve">AWAMAPP image repository: lansalpc/vldemoapp-servercore</w:t>
       </w:r>
     </w:p>
-    <w:p/>
     <w:p>
       <w:r>
         <w:t xml:space="preserve">Floating label tags (example: v16ga-ltsc2025) are for ease of customer testing.</w:t>
       </w:r>
     </w:p>
-    <w:p/>
     <w:p>
       <w:r>
         <w:t xml:space="preserve">Use immutable tags for production (example: 16.0.26030-ltsc2025).</w:t>
       </w:r>
     </w:p>
-    <w:p/>
     <w:p>
       <w:pPr>
         <w:pStyle w:val="Heading1"/>
@@ -133,13 +191,11 @@
         <w:t xml:space="preserve">Creates the install container (LANSA-APP) and runs init.ps1 to install the MSI into the base image.</w:t>
       </w:r>
     </w:p>
-    <w:p/>
     <w:p>
       <w:r>
         <w:t xml:space="preserve">Key inputs: -DockerLabel, -VersionNum, -VersionLabel, -SQLHost (optional), -SQLPort (optional), -Trace (optional), -Cloud (required).</w:t>
       </w:r>
     </w:p>
-    <w:p/>
     <w:p>
       <w:r>
         <w:t xml:space="preserve">Before </w:t>
@@ -199,11 +255,7 @@
         <w:t xml:space="preserve"> are skipped. This provides Dockerfile-like override behavior without rebuilding the base image.</w:t>
       </w:r>
     </w:p>
-    <w:p/>
-    <w:p>
-      <w:r>
-        <w:t xml:space="preserve"/>
-      </w:r>
+    <w:p>
       <w:r>
         <w:rPr>
           <w:rFonts w:ascii="Consolas" w:hAnsi="Consolas"/>
@@ -223,7 +275,6 @@
         <w:t xml:space="preserve">.</w:t>
       </w:r>
     </w:p>
-    <w:p/>
     <w:p>
       <w:r>
         <w:t xml:space="preserve">When </w:t>
@@ -251,9 +302,6 @@
         </w:rPr>
         <w:t xml:space="preserve">AZURE_TENANT_ID</w:t>
       </w:r>
-      <w:r>
-        <w:t xml:space="preserve"/>
-      </w:r>
     </w:p>
     <w:p>
       <w:pPr>
@@ -268,9 +316,6 @@
         </w:rPr>
         <w:t xml:space="preserve">AZURE_CLIENT_ID</w:t>
       </w:r>
-      <w:r>
-        <w:t xml:space="preserve"/>
-      </w:r>
     </w:p>
     <w:p>
       <w:pPr>
@@ -285,9 +330,6 @@
         </w:rPr>
         <w:t xml:space="preserve">AZURE_CLIENT_SECRET</w:t>
       </w:r>
-      <w:r>
-        <w:t xml:space="preserve"/>
-      </w:r>
     </w:p>
     <w:p>
       <w:pPr>
@@ -302,11 +344,7 @@
         </w:rPr>
         <w:t xml:space="preserve">AZURE_LOCATION</w:t>
       </w:r>
-      <w:r>
-        <w:t xml:space="preserve"/>
-      </w:r>
-    </w:p>
-    <w:p/>
+    </w:p>
     <w:p>
       <w:r>
         <w:t xml:space="preserve">When </w:t>
@@ -334,9 +372,6 @@
         </w:rPr>
         <w:t xml:space="preserve">AWS_ACCESS_KEY_ID</w:t>
       </w:r>
-      <w:r>
-        <w:t xml:space="preserve"/>
-      </w:r>
     </w:p>
     <w:p>
       <w:pPr>
@@ -351,9 +386,6 @@
         </w:rPr>
         <w:t xml:space="preserve">AWS_SECRET_ACCESS_KEY</w:t>
       </w:r>
-      <w:r>
-        <w:t xml:space="preserve"/>
-      </w:r>
     </w:p>
     <w:p>
       <w:pPr>
@@ -368,11 +400,7 @@
         </w:rPr>
         <w:t xml:space="preserve">AWS_DEFAULT_REGION</w:t>
       </w:r>
-      <w:r>
-        <w:t xml:space="preserve"/>
-      </w:r>
-    </w:p>
-    <w:p/>
+    </w:p>
     <w:p>
       <w:r>
         <w:t xml:space="preserve">When </w:t>
@@ -396,11 +424,7 @@
         <w:t xml:space="preserve"> is also passed through if it exists on the host.</w:t>
       </w:r>
     </w:p>
-    <w:p/>
-    <w:p>
-      <w:r>
-        <w:t xml:space="preserve"/>
-      </w:r>
+    <w:p>
       <w:r>
         <w:rPr>
           <w:rFonts w:ascii="Consolas" w:hAnsi="Consolas"/>
@@ -429,13 +453,11 @@
         <w:t xml:space="preserve"> to end that PowerShell window. This stops the container so the image can then be committed.</w:t>
       </w:r>
     </w:p>
-    <w:p/>
     <w:p>
       <w:r>
         <w:t xml:space="preserve">The provided scripts expose the container's port 80 as port 50080. Therefore an example url to execute a WAM is http://localhost:50080/cgi-bin/lansaweb?wam=DEPTABWA&amp;webrtn=BuildFirst&amp;ml=LANSA:XHTML&amp;part=DEX&amp;lang=ENG</w:t>
       </w:r>
     </w:p>
-    <w:p/>
     <w:p>
       <w:pPr>
         <w:pStyle w:val="Heading2"/>
@@ -467,7 +489,6 @@
         <w:t xml:space="preserve">.</w:t>
       </w:r>
     </w:p>
-    <w:p/>
     <w:p>
       <w:r>
         <w:t xml:space="preserve">Do not restart a stopped </w:t>
@@ -491,7 +512,6 @@
         <w:t xml:space="preserve">, so starting it again reruns the install flow.</w:t>
       </w:r>
     </w:p>
-    <w:p/>
     <w:p>
       <w:pPr>
         <w:pStyle w:val="Heading2"/>
@@ -505,7 +525,6 @@
         <w:t xml:space="preserve">If an additional DLL must be added after the MSI install, there are two supported approaches. And you should consider re-building the MSI and then re-building the application Docker image.</w:t>
       </w:r>
     </w:p>
-    <w:p/>
     <w:p>
       <w:r>
         <w:t xml:space="preserve">Quick one-off test:</w:t>
@@ -612,7 +631,6 @@
         <w:t xml:space="preserve"> to capture the patched container as an image.</w:t>
       </w:r>
     </w:p>
-    <w:p/>
     <w:p>
       <w:r>
         <w:t xml:space="preserve">Repeatable patch image:</w:t>
@@ -712,7 +730,6 @@
         <w:t xml:space="preserve">• Its a very fast process so it may as well be used every time you need to patch.</w:t>
       </w:r>
     </w:p>
-    <w:p/>
     <w:p>
       <w:pPr>
         <w:pStyle w:val="Heading2"/>
@@ -726,19 +743,16 @@
         <w:t xml:space="preserve">Runs the committed image for test/validation.</w:t>
       </w:r>
     </w:p>
-    <w:p/>
     <w:p>
       <w:r>
         <w:t xml:space="preserve">Key inputs: -DockerLabel, -VersionNum, -SQLHost (optional), -SQLPort (optional), -SQLDsn (optional), -Trace (optional), -ByPassSQLServerDNSChecks (optional).</w:t>
       </w:r>
     </w:p>
-    <w:p/>
     <w:p>
       <w:r>
         <w:t xml:space="preserve">run_img.ps1 can be run without database parameters if the database server has not changed. In that case, pass -ByPassSQLServerDNSChecks so bootstrap.ps1 skips DNS and ODBC validation. But note that stopping a Cloud VM and restarting it may change the VM IP Address and if your database is on the container host the ODBC DSN needs to be modified. run_img.ps1 obtains the current IP address and passes it to bootstrap.ps1 to modify the ODBC DSN. It also is quite quick, so its recommended to always run without -ByPassSQLServerDNSChecks.</w:t>
       </w:r>
     </w:p>
-    <w:p/>
     <w:p>
       <w:pPr>
         <w:pStyle w:val="Heading1"/>
@@ -760,7 +774,6 @@
         <w:t xml:space="preserve">This uses the host NAT address by default and port 1433.</w:t>
       </w:r>
     </w:p>
-    <w:p/>
     <w:p>
       <w:r>
         <w:t xml:space="preserve">Command:</w:t>
@@ -778,7 +791,6 @@
         <w:t xml:space="preserve">.\run.ps1 -DockerLabel ltsc2025 -VersionNum 16.0.0 -VersionLabel "V16 GA" -Cloud Azure</w:t>
       </w:r>
     </w:p>
-    <w:p/>
     <w:p>
       <w:pPr>
         <w:pStyle w:val="Heading2"/>
@@ -792,7 +804,6 @@
         <w:t xml:space="preserve">Provide a stable DNS name and port.</w:t>
       </w:r>
     </w:p>
-    <w:p/>
     <w:p>
       <w:r>
         <w:t xml:space="preserve">Command:</w:t>
@@ -810,7 +821,6 @@
         <w:t xml:space="preserve">.\run.ps1 -DockerLabel ltsc2025 -VersionNum 16.0.0 -VersionLabel "V16 GA" -SQLHost sql01.corp.local -SQLPort 1433 -Cloud Azure</w:t>
       </w:r>
     </w:p>
-    <w:p/>
     <w:p>
       <w:pPr>
         <w:pStyle w:val="Heading2"/>
@@ -851,7 +861,6 @@
         <w:t xml:space="preserve">.</w:t>
       </w:r>
     </w:p>
-    <w:p/>
     <w:p>
       <w:r>
         <w:t xml:space="preserve">Command:</w:t>
@@ -869,7 +878,6 @@
         <w:t xml:space="preserve">.\commit.ps1 -DockerLabel ltsc2025 -VersionNum 16.0.26030</w:t>
       </w:r>
     </w:p>
-    <w:p/>
     <w:p>
       <w:pPr>
         <w:pStyle w:val="Heading2"/>
@@ -883,7 +891,6 @@
         <w:t xml:space="preserve">These overrides are applied at runtime by C:\bootstrap.ps1.</w:t>
       </w:r>
     </w:p>
-    <w:p/>
     <w:p>
       <w:r>
         <w:t xml:space="preserve">Command:</w:t>
@@ -901,7 +908,6 @@
         <w:t xml:space="preserve">.\run_img.ps1 -DockerLabel ltsc2025 -VersionNum 16.0.26030 -SQLHost sql01.corp.local -SQLPort 1433 -Trace</w:t>
       </w:r>
     </w:p>
-    <w:p/>
     <w:p>
       <w:pPr>
         <w:pStyle w:val="Heading2"/>
@@ -915,7 +921,6 @@
         <w:t xml:space="preserve">Use this only when the database server has not changed since install.</w:t>
       </w:r>
     </w:p>
-    <w:p/>
     <w:p>
       <w:r>
         <w:t xml:space="preserve">Command:</w:t>
@@ -933,7 +938,6 @@
         <w:t xml:space="preserve">.\run_img.ps1 -DockerLabel ltsc2025 -VersionNum 16.0.26030 -ByPassSQLServerDNSChecks</w:t>
       </w:r>
     </w:p>
-    <w:p/>
     <w:p>
       <w:pPr>
         <w:pStyle w:val="Heading2"/>
@@ -965,7 +969,6 @@
         <w:t xml:space="preserve"> is still running.</w:t>
       </w:r>
     </w:p>
-    <w:p/>
     <w:p>
       <w:r>
         <w:t xml:space="preserve">Command:</w:t>
@@ -983,7 +986,6 @@
         <w:t xml:space="preserve">docker exec -it LANSA-APP powershell -NoLogo</w:t>
       </w:r>
     </w:p>
-    <w:p/>
     <w:p>
       <w:pPr>
         <w:pStyle w:val="Heading2"/>
@@ -1015,7 +1017,6 @@
         <w:t xml:space="preserve">.</w:t>
       </w:r>
     </w:p>
-    <w:p/>
     <w:p>
       <w:r>
         <w:t xml:space="preserve">Command:</w:t>
@@ -1033,7 +1034,6 @@
         <w:t xml:space="preserve">docker exec LANSA-APP powershell -NoLogo -NoProfile -Command "Copy-Item 'C:\docker\iis\AWAMAPP\Patch\X_PDFMS.DLL' 'C:\Program Files (x86)\Docker\X_Win95\X_Lansa\Execute\X_Pdfms.dll' -Force"</w:t>
       </w:r>
     </w:p>
-    <w:p/>
     <w:p>
       <w:pPr>
         <w:pStyle w:val="Heading2"/>
@@ -1074,7 +1074,6 @@
         <w:t xml:space="preserve">.</w:t>
       </w:r>
     </w:p>
-    <w:p/>
     <w:p>
       <w:r>
         <w:t xml:space="preserve">Command:</w:t>
@@ -1104,7 +1103,106 @@
         <w:t xml:space="preserve">.\build.ps1</w:t>
       </w:r>
     </w:p>
-    <w:p/>
+    <w:p>
+      <w:pPr>
+        <w:pStyle w:val="Heading2"/>
+      </w:pPr>
+      <w:r>
+        <w:t xml:space="preserve">5.9 Build V15 Application Image</w:t>
+      </w:r>
+    </w:p>
+    <w:p>
+      <w:r>
+        <w:t xml:space="preserve">V15 Cloud Account ID license file added to the AWAMAPP directory.</w:t>
+      </w:r>
+    </w:p>
+    <w:p>
+      <w:r>
+        <w:t xml:space="preserve">The MSI file in run.ps1 changed to the V15 MSI file.</w:t>
+      </w:r>
+    </w:p>
+    <w:p>
+      <w:r>
+        <w:t xml:space="preserve">Database name changed to AWAMAPP-V15 on the run.ps1 command line</w:t>
+      </w:r>
+    </w:p>
+    <w:p>
+      <w:r>
+        <w:t xml:space="preserve">Command</w:t>
+      </w:r>
+    </w:p>
+    <w:p>
+      <w:pPr>
+        <w:ind w:left="360"/>
+      </w:pPr>
+      <w:r>
+        <w:rPr>
+          <w:rFonts w:ascii="Consolas" w:hAnsi="Consolas"/>
+          <w:sz w:val="20"/>
+        </w:rPr>
+        <w:t xml:space="preserve">cd iis\AWAMAPP</w:t>
+      </w:r>
+    </w:p>
+    <w:p>
+      <w:pPr>
+        <w:ind w:left="360"/>
+      </w:pPr>
+      <w:r>
+        <w:rPr>
+          <w:rFonts w:ascii="Consolas" w:hAnsi="Consolas"/>
+          <w:sz w:val="20"/>
+        </w:rPr>
+        <w:t xml:space="preserve">.\run.ps1 -DockerLabel ltsc2025 -VersionNum 15.0.0 -Cloud Azure -DbName 'AWAMAPP-V15'</w:t>
+      </w:r>
+    </w:p>
+    <w:p>
+      <w:pPr>
+        <w:ind w:left="360"/>
+      </w:pPr>
+      <w:r>
+        <w:rPr>
+          <w:rFonts w:ascii="Consolas" w:hAnsi="Consolas"/>
+          <w:sz w:val="20"/>
+        </w:rPr>
+        <w:t xml:space="preserve">.\commit.ps1 -DockerLabel ltsc2025 -VersionNum 15.0.26010 -VersionLabel "V15 GA" -Cloud Azure</w:t>
+      </w:r>
+    </w:p>
+    <w:p>
+      <w:pPr>
+        <w:ind w:left="360"/>
+      </w:pPr>
+      <w:r>
+        <w:rPr>
+          <w:rFonts w:ascii="Consolas" w:hAnsi="Consolas"/>
+          <w:sz w:val="20"/>
+        </w:rPr>
+        <w:t xml:space="preserve">cd patch</w:t>
+      </w:r>
+    </w:p>
+    <w:p>
+      <w:pPr>
+        <w:ind w:left="360"/>
+      </w:pPr>
+      <w:r>
+        <w:rPr>
+          <w:rFonts w:ascii="Consolas" w:hAnsi="Consolas"/>
+          <w:sz w:val="20"/>
+        </w:rPr>
+        <w:t xml:space="preserve">.\build.ps1 -Cloud Azure -ParentVersionNum 15.0.26010</w:t>
+      </w:r>
+    </w:p>
+    <w:p>
+      <w:pPr>
+        <w:ind w:left="360"/>
+      </w:pPr>
+      <w:r>
+        <w:rPr>
+          <w:rFonts w:ascii="Consolas" w:hAnsi="Consolas"/>
+          <w:sz w:val="20"/>
+        </w:rPr>
+        <w:t xml:space="preserve">.\run_img.ps1 -Cloud Azure -VersionNum 15.0.26010.1 -trace</w:t>
+      </w:r>
+    </w:p>
     <w:p>
       <w:pPr>
         <w:pStyle w:val="Heading1"/>
@@ -1137,7 +1235,6 @@
         <w:t xml:space="preserve">• If a Powershell command window is opened inside the container, the Powershell prompt will display 'Cont C:\&gt;' instead of the standard 'PS C:\&gt;' to clearly show its in the container.</w:t>
       </w:r>
     </w:p>
-    <w:p/>
     <w:p>
       <w:pPr>
         <w:pStyle w:val="Heading1"/>
@@ -1146,13 +1243,11 @@
         <w:t xml:space="preserve">Example Image Tags</w:t>
       </w:r>
     </w:p>
-    <w:p/>
     <w:p>
       <w:r>
         <w:t xml:space="preserve">The following example shows immutable and floating tags for the AWAMAPP and Base images.</w:t>
       </w:r>
     </w:p>
-    <w:p/>
     <w:p>
       <w:pPr>
         <w:jc w:val="center"/>
@@ -1195,7 +1290,6 @@
         </w:drawing>
       </w:r>
     </w:p>
-    <w:p/>
     <w:sectPr>
       <w:pgSz w:w="12240" w:h="15840"/>
       <w:pgMar w:top="1440" w:right="1440" w:bottom="1440" w:left="1440" w:header="720" w:footer="720" w:gutter="0"/>

</xml_diff>

<commit_message>
JIRA LANSA-504 Update the docx file using codex.
</commit_message>
<xml_diff>
--- a/Docker/LANSA Docker Image creation and Usage Instructions.docx
+++ b/Docker/LANSA Docker Image creation and Usage Instructions.docx
@@ -25,6 +25,20 @@
     </w:p>
     <w:p>
       <w:r>
+        <w:t xml:space="preserve">The example code presumes that the git hub repo is cloned into the directory </w:t>
+      </w:r>
+      <w:r>
+        <w:rPr>
+          <w:rFonts w:ascii="Consolas" w:hAnsi="Consolas"/>
+        </w:rPr>
+        <w:t xml:space="preserve">C:\dev\cookbooks</w:t>
+      </w:r>
+      <w:r>
+        <w:t xml:space="preserve">.</w:t>
+      </w:r>
+    </w:p>
+    <w:p>
+      <w:r>
         <w:t xml:space="preserve">I have published a Visual LANSA runtime base image to Docker Hub. The AWAMAPP example image is not published. The base image includes only the prerequisites to install and run LANSA.</w:t>
       </w:r>
     </w:p>
@@ -96,7 +110,7 @@
     </w:p>
     <w:p>
       <w:r>
-        <w:t xml:space="preserve">You will need to install Hot Fix EPC160000HF_260417 for V16 and Hot Fix ****** for V15 and construct an MSI to deploy into the Docker image. These Hot Fixes enable Cloud Account Id licensing in a Docker image for both AWS and Azure. I have tested both. Scripts in the above github repo require a Cloud type to be supplied when constructing the application image.</w:t>
+        <w:t xml:space="preserve">You will need to install Hot Fix EPC160000HF_260417 for V16 and Hot Fix EPC150070HF_260421 for V15 and construct an MSI to deploy into the Docker image. These Hot Fixes enable Cloud Account Id licensing in a Docker image for both AWS and Azure. I have tested both. Scripts in the above github repo require a Cloud type to be supplied when constructing the application image.</w:t>
       </w:r>
     </w:p>
     <w:p>
@@ -193,12 +207,590 @@
     </w:p>
     <w:p>
       <w:r>
-        <w:t xml:space="preserve">Key inputs: -DockerLabel, -VersionNum, -VersionLabel, -SQLHost (optional), -SQLPort (optional), -Trace (optional), -Cloud (required).</w:t>
-      </w:r>
-    </w:p>
-    <w:p>
-      <w:r>
-        <w:t xml:space="preserve">Before </w:t>
+        <w:t xml:space="preserve">Key inputs: </w:t>
+      </w:r>
+      <w:r>
+        <w:rPr>
+          <w:rFonts w:ascii="Consolas" w:hAnsi="Consolas"/>
+        </w:rPr>
+        <w:t xml:space="preserve">-MSIuri</w:t>
+      </w:r>
+      <w:r>
+        <w:t xml:space="preserve">, </w:t>
+      </w:r>
+      <w:r>
+        <w:rPr>
+          <w:rFonts w:ascii="Consolas" w:hAnsi="Consolas"/>
+        </w:rPr>
+        <w:t xml:space="preserve">-DockerLabel</w:t>
+      </w:r>
+      <w:r>
+        <w:t xml:space="preserve">, </w:t>
+      </w:r>
+      <w:r>
+        <w:rPr>
+          <w:rFonts w:ascii="Consolas" w:hAnsi="Consolas"/>
+        </w:rPr>
+        <w:t xml:space="preserve">-VersionNum</w:t>
+      </w:r>
+      <w:r>
+        <w:t xml:space="preserve">, </w:t>
+      </w:r>
+      <w:r>
+        <w:rPr>
+          <w:rFonts w:ascii="Consolas" w:hAnsi="Consolas"/>
+        </w:rPr>
+        <w:t xml:space="preserve">-VersionLabel</w:t>
+      </w:r>
+      <w:r>
+        <w:t xml:space="preserve">, </w:t>
+      </w:r>
+      <w:r>
+        <w:rPr>
+          <w:rFonts w:ascii="Consolas" w:hAnsi="Consolas"/>
+        </w:rPr>
+        <w:t xml:space="preserve">-SQLHost</w:t>
+      </w:r>
+      <w:r>
+        <w:t xml:space="preserve"> (optional), </w:t>
+      </w:r>
+      <w:r>
+        <w:rPr>
+          <w:rFonts w:ascii="Consolas" w:hAnsi="Consolas"/>
+        </w:rPr>
+        <w:t xml:space="preserve">-SQLPort</w:t>
+      </w:r>
+      <w:r>
+        <w:t xml:space="preserve"> (optional), </w:t>
+      </w:r>
+      <w:r>
+        <w:rPr>
+          <w:rFonts w:ascii="Consolas" w:hAnsi="Consolas"/>
+        </w:rPr>
+        <w:t xml:space="preserve">-Trace</w:t>
+      </w:r>
+      <w:r>
+        <w:t xml:space="preserve"> (optional), </w:t>
+      </w:r>
+      <w:r>
+        <w:rPr>
+          <w:rFonts w:ascii="Consolas" w:hAnsi="Consolas"/>
+        </w:rPr>
+        <w:t xml:space="preserve">-Cloud</w:t>
+      </w:r>
+      <w:r>
+        <w:t xml:space="preserve"> (required).</w:t>
+      </w:r>
+    </w:p>
+    <w:p>
+      <w:r>
+        <w:rPr>
+          <w:rFonts w:ascii="Consolas" w:hAnsi="Consolas"/>
+        </w:rPr>
+        <w:t xml:space="preserve">run.ps1</w:t>
+      </w:r>
+      <w:r>
+        <w:t xml:space="preserve"> maps the following host paths to Container paths using this syntax on the </w:t>
+      </w:r>
+      <w:r>
+        <w:rPr>
+          <w:rFonts w:ascii="Consolas" w:hAnsi="Consolas"/>
+        </w:rPr>
+        <w:t xml:space="preserve">docker run</w:t>
+      </w:r>
+      <w:r>
+        <w:t xml:space="preserve"> command:</w:t>
+      </w:r>
+    </w:p>
+    <w:p>
+      <w:pPr>
+        <w:pStyle w:val="CodeBlock"/>
+      </w:pPr>
+      <w:r>
+        <w:rPr>
+          <w:rFonts w:ascii="Consolas" w:hAnsi="Consolas"/>
+        </w:rPr>
+        <w:t xml:space="preserve">-v c:\temp:c:\temp -v c:\secrets:c:\secrets -v C:\msi:c:\msi `</w:t>
+      </w:r>
+    </w:p>
+    <w:p>
+      <w:pPr>
+        <w:pStyle w:val="CodeBlock"/>
+      </w:pPr>
+      <w:r>
+        <w:rPr>
+          <w:rFonts w:ascii="Consolas" w:hAnsi="Consolas"/>
+        </w:rPr>
+        <w:t xml:space="preserve">-v C:\dev\cookbooks\Docker:C:\docker</w:t>
+      </w:r>
+    </w:p>
+    <w:p>
+      <w:r>
+        <w:t xml:space="preserve">Graphically this may be represented like this:</w:t>
+      </w:r>
+    </w:p>
+    <w:tbl>
+      <w:tblPr>
+        <w:tblW w:w="0" w:type="auto"/>
+        <w:tblBorders>
+          <w:top w:val="single" w:sz="4" w:space="0" w:color="808080"/>
+          <w:left w:val="single" w:sz="4" w:space="0" w:color="808080"/>
+          <w:bottom w:val="single" w:sz="4" w:space="0" w:color="808080"/>
+          <w:right w:val="single" w:sz="4" w:space="0" w:color="808080"/>
+          <w:insideH w:val="single" w:sz="4" w:space="0" w:color="C0C0C0"/>
+          <w:insideV w:val="single" w:sz="4" w:space="0" w:color="C0C0C0"/>
+        </w:tblBorders>
+      </w:tblPr>
+      <w:tblGrid>
+        <w:gridCol w:w="4500"/>
+        <w:gridCol w:w="4500"/>
+      </w:tblGrid>
+      <w:tr>
+        <w:tc>
+          <w:tcPr>
+            <w:tcW w:w="4500" w:type="dxa"/>
+            <w:shd w:val="clear" w:color="auto" w:fill="D9EAF7"/>
+          </w:tcPr>
+          <w:p>
+            <w:r>
+              <w:rPr>
+                <w:b/>
+              </w:rPr>
+              <w:t xml:space="preserve">Host Path</w:t>
+            </w:r>
+          </w:p>
+        </w:tc>
+        <w:tc>
+          <w:tcPr>
+            <w:tcW w:w="4500" w:type="dxa"/>
+            <w:shd w:val="clear" w:color="auto" w:fill="D9EAF7"/>
+          </w:tcPr>
+          <w:p>
+            <w:r>
+              <w:rPr>
+                <w:b/>
+              </w:rPr>
+              <w:t xml:space="preserve">Container Path</w:t>
+            </w:r>
+          </w:p>
+        </w:tc>
+      </w:tr>
+      <w:tr>
+        <w:tc>
+          <w:tcPr>
+            <w:tcW w:w="4500" w:type="dxa"/>
+          </w:tcPr>
+          <w:p>
+            <w:r>
+              <w:rPr>
+                <w:rFonts w:ascii="Consolas" w:hAnsi="Consolas"/>
+              </w:rPr>
+              <w:t xml:space="preserve">c:\temp</w:t>
+            </w:r>
+          </w:p>
+        </w:tc>
+        <w:tc>
+          <w:tcPr>
+            <w:tcW w:w="4500" w:type="dxa"/>
+          </w:tcPr>
+          <w:p>
+            <w:r>
+              <w:rPr>
+                <w:rFonts w:ascii="Consolas" w:hAnsi="Consolas"/>
+              </w:rPr>
+              <w:t xml:space="preserve">c:\temp</w:t>
+            </w:r>
+          </w:p>
+        </w:tc>
+      </w:tr>
+      <w:tr>
+        <w:tc>
+          <w:tcPr>
+            <w:tcW w:w="4500" w:type="dxa"/>
+          </w:tcPr>
+          <w:p>
+            <w:r>
+              <w:rPr>
+                <w:rFonts w:ascii="Consolas" w:hAnsi="Consolas"/>
+              </w:rPr>
+              <w:t xml:space="preserve">c:\secrets</w:t>
+            </w:r>
+          </w:p>
+        </w:tc>
+        <w:tc>
+          <w:tcPr>
+            <w:tcW w:w="4500" w:type="dxa"/>
+          </w:tcPr>
+          <w:p>
+            <w:r>
+              <w:rPr>
+                <w:rFonts w:ascii="Consolas" w:hAnsi="Consolas"/>
+              </w:rPr>
+              <w:t xml:space="preserve">c:\secrets</w:t>
+            </w:r>
+          </w:p>
+        </w:tc>
+      </w:tr>
+      <w:tr>
+        <w:tc>
+          <w:tcPr>
+            <w:tcW w:w="4500" w:type="dxa"/>
+          </w:tcPr>
+          <w:p>
+            <w:r>
+              <w:rPr>
+                <w:rFonts w:ascii="Consolas" w:hAnsi="Consolas"/>
+              </w:rPr>
+              <w:t xml:space="preserve">C:\msi</w:t>
+            </w:r>
+          </w:p>
+        </w:tc>
+        <w:tc>
+          <w:tcPr>
+            <w:tcW w:w="4500" w:type="dxa"/>
+          </w:tcPr>
+          <w:p>
+            <w:r>
+              <w:rPr>
+                <w:rFonts w:ascii="Consolas" w:hAnsi="Consolas"/>
+              </w:rPr>
+              <w:t xml:space="preserve">c:\msi</w:t>
+            </w:r>
+          </w:p>
+        </w:tc>
+      </w:tr>
+      <w:tr>
+        <w:tc>
+          <w:tcPr>
+            <w:tcW w:w="4500" w:type="dxa"/>
+          </w:tcPr>
+          <w:p>
+            <w:r>
+              <w:rPr>
+                <w:rFonts w:ascii="Consolas" w:hAnsi="Consolas"/>
+              </w:rPr>
+              <w:t xml:space="preserve">C:\dev\cookbooks\Docker</w:t>
+            </w:r>
+          </w:p>
+        </w:tc>
+        <w:tc>
+          <w:tcPr>
+            <w:tcW w:w="4500" w:type="dxa"/>
+          </w:tcPr>
+          <w:p>
+            <w:r>
+              <w:rPr>
+                <w:rFonts w:ascii="Consolas" w:hAnsi="Consolas"/>
+              </w:rPr>
+              <w:t xml:space="preserve">C:\docker</w:t>
+            </w:r>
+          </w:p>
+        </w:tc>
+      </w:tr>
+    </w:tbl>
+    <w:p>
+      <w:r>
+        <w:rPr>
+          <w:rFonts w:ascii="Consolas" w:hAnsi="Consolas"/>
+        </w:rPr>
+        <w:t xml:space="preserve">c:\temp</w:t>
+      </w:r>
+      <w:r>
+        <w:t xml:space="preserve"> is expected by the installed application with installation logs and trace files output by the container to its </w:t>
+      </w:r>
+      <w:r>
+        <w:rPr>
+          <w:rFonts w:ascii="Consolas" w:hAnsi="Consolas"/>
+        </w:rPr>
+        <w:t xml:space="preserve">c:\temp</w:t>
+      </w:r>
+      <w:r>
+        <w:t xml:space="preserve"> directory. Always provide this mapping.</w:t>
+      </w:r>
+    </w:p>
+    <w:p>
+      <w:r>
+        <w:rPr>
+          <w:rFonts w:ascii="Consolas" w:hAnsi="Consolas"/>
+        </w:rPr>
+        <w:t xml:space="preserve">c:\secrets</w:t>
+      </w:r>
+      <w:r>
+        <w:t xml:space="preserve"> should contain two files: </w:t>
+      </w:r>
+      <w:r>
+        <w:rPr>
+          <w:rFonts w:ascii="Consolas" w:hAnsi="Consolas"/>
+        </w:rPr>
+        <w:t xml:space="preserve">dbpassword.txt</w:t>
+      </w:r>
+      <w:r>
+        <w:t xml:space="preserve"> and </w:t>
+      </w:r>
+      <w:r>
+        <w:rPr>
+          <w:rFonts w:ascii="Consolas" w:hAnsi="Consolas"/>
+        </w:rPr>
+        <w:t xml:space="preserve">webpassword.txt</w:t>
+      </w:r>
+      <w:r>
+        <w:t xml:space="preserve">. The database user password and web user password need to exist in these files. They may be injected into these files using similar techniques described in section (6) for the Cloud secrets. Alternatively, they may also be passed on the command line using </w:t>
+      </w:r>
+      <w:r>
+        <w:rPr>
+          <w:rFonts w:ascii="Consolas" w:hAnsi="Consolas"/>
+        </w:rPr>
+        <w:t xml:space="preserve">-dbpassword</w:t>
+      </w:r>
+      <w:r>
+        <w:t xml:space="preserve"> and </w:t>
+      </w:r>
+      <w:r>
+        <w:rPr>
+          <w:rFonts w:ascii="Consolas" w:hAnsi="Consolas"/>
+        </w:rPr>
+        <w:t xml:space="preserve">-webpassword</w:t>
+      </w:r>
+      <w:r>
+        <w:t xml:space="preserve"> as Powershell secure strings.</w:t>
+      </w:r>
+    </w:p>
+    <w:p>
+      <w:r>
+        <w:t xml:space="preserve">A directory needs to be mapped to the directory where the MSI is installed and </w:t>
+      </w:r>
+      <w:r>
+        <w:rPr>
+          <w:b/>
+        </w:rPr>
+        <w:t xml:space="preserve">the container's</w:t>
+      </w:r>
+      <w:r>
+        <w:t xml:space="preserve"> path to the MSI provided in the </w:t>
+      </w:r>
+      <w:r>
+        <w:rPr>
+          <w:rFonts w:ascii="Consolas" w:hAnsi="Consolas"/>
+        </w:rPr>
+        <w:t xml:space="preserve">-MSIuri</w:t>
+      </w:r>
+      <w:r>
+        <w:t xml:space="preserve"> parameter. If the shipped value of </w:t>
+      </w:r>
+      <w:r>
+        <w:rPr>
+          <w:rFonts w:ascii="Consolas" w:hAnsi="Consolas"/>
+        </w:rPr>
+        <w:t xml:space="preserve">MSIuri</w:t>
+      </w:r>
+      <w:r>
+        <w:t xml:space="preserve"> is used - </w:t>
+      </w:r>
+      <w:r>
+        <w:rPr>
+          <w:rFonts w:ascii="Consolas" w:hAnsi="Consolas"/>
+        </w:rPr>
+        <w:t xml:space="preserve">c:\msi</w:t>
+      </w:r>
+      <w:r>
+        <w:t xml:space="preserve"> for both host and container then no confusion will occur as the path is the same in both contexts.</w:t>
+      </w:r>
+    </w:p>
+    <w:p>
+      <w:r>
+        <w:t xml:space="preserve">The github repo location of the source code is provided by mapping </w:t>
+      </w:r>
+      <w:r>
+        <w:rPr>
+          <w:rFonts w:ascii="Consolas" w:hAnsi="Consolas"/>
+        </w:rPr>
+        <w:t xml:space="preserve">C:\dev\cookbooks\Docker</w:t>
+      </w:r>
+      <w:r>
+        <w:t xml:space="preserve"> on the host to </w:t>
+      </w:r>
+      <w:r>
+        <w:rPr>
+          <w:rFonts w:ascii="Consolas" w:hAnsi="Consolas"/>
+        </w:rPr>
+        <w:t xml:space="preserve">C:\Docker</w:t>
+      </w:r>
+      <w:r>
+        <w:t xml:space="preserve"> in the container making the entire contents available for container construction but not included in the image.</w:t>
+      </w:r>
+    </w:p>
+    <w:p>
+      <w:r>
+        <w:rPr>
+          <w:rFonts w:ascii="Consolas" w:hAnsi="Consolas"/>
+        </w:rPr>
+        <w:t xml:space="preserve">run.ps1</w:t>
+      </w:r>
+      <w:r>
+        <w:t xml:space="preserve"> passes selected host environment variables through to the container based on </w:t>
+      </w:r>
+      <w:r>
+        <w:rPr>
+          <w:rFonts w:ascii="Consolas" w:hAnsi="Consolas"/>
+        </w:rPr>
+        <w:t xml:space="preserve">-Cloud</w:t>
+      </w:r>
+      <w:r>
+        <w:t xml:space="preserve">.</w:t>
+      </w:r>
+    </w:p>
+    <w:p>
+      <w:r>
+        <w:t xml:space="preserve">When </w:t>
+      </w:r>
+      <w:r>
+        <w:rPr>
+          <w:rFonts w:ascii="Consolas" w:hAnsi="Consolas"/>
+        </w:rPr>
+        <w:t xml:space="preserve">-Cloud Azure</w:t>
+      </w:r>
+      <w:r>
+        <w:t xml:space="preserve">, these host environment variables must exist:</w:t>
+      </w:r>
+    </w:p>
+    <w:p>
+      <w:pPr>
+        <w:ind w:left="720" w:hanging="360"/>
+      </w:pPr>
+      <w:r>
+        <w:t xml:space="preserve">• </w:t>
+      </w:r>
+      <w:r>
+        <w:rPr>
+          <w:rFonts w:ascii="Consolas" w:hAnsi="Consolas"/>
+        </w:rPr>
+        <w:t xml:space="preserve">AZURE_TENANT_ID</w:t>
+      </w:r>
+    </w:p>
+    <w:p>
+      <w:pPr>
+        <w:ind w:left="720" w:hanging="360"/>
+      </w:pPr>
+      <w:r>
+        <w:t xml:space="preserve">• </w:t>
+      </w:r>
+      <w:r>
+        <w:rPr>
+          <w:rFonts w:ascii="Consolas" w:hAnsi="Consolas"/>
+        </w:rPr>
+        <w:t xml:space="preserve">AZURE_CLIENT_ID</w:t>
+      </w:r>
+    </w:p>
+    <w:p>
+      <w:pPr>
+        <w:ind w:left="720" w:hanging="360"/>
+      </w:pPr>
+      <w:r>
+        <w:t xml:space="preserve">• </w:t>
+      </w:r>
+      <w:r>
+        <w:rPr>
+          <w:rFonts w:ascii="Consolas" w:hAnsi="Consolas"/>
+        </w:rPr>
+        <w:t xml:space="preserve">AZURE_CLIENT_SECRET</w:t>
+      </w:r>
+    </w:p>
+    <w:p>
+      <w:pPr>
+        <w:ind w:left="720" w:hanging="360"/>
+      </w:pPr>
+      <w:r>
+        <w:t xml:space="preserve">• </w:t>
+      </w:r>
+      <w:r>
+        <w:rPr>
+          <w:rFonts w:ascii="Consolas" w:hAnsi="Consolas"/>
+        </w:rPr>
+        <w:t xml:space="preserve">AZURE_LOCATION</w:t>
+      </w:r>
+    </w:p>
+    <w:p>
+      <w:r>
+        <w:t xml:space="preserve">When </w:t>
+      </w:r>
+      <w:r>
+        <w:rPr>
+          <w:rFonts w:ascii="Consolas" w:hAnsi="Consolas"/>
+        </w:rPr>
+        <w:t xml:space="preserve">-Cloud AWS</w:t>
+      </w:r>
+      <w:r>
+        <w:t xml:space="preserve">, these host environment variables must exist:</w:t>
+      </w:r>
+    </w:p>
+    <w:p>
+      <w:pPr>
+        <w:ind w:left="720" w:hanging="360"/>
+      </w:pPr>
+      <w:r>
+        <w:t xml:space="preserve">• </w:t>
+      </w:r>
+      <w:r>
+        <w:rPr>
+          <w:rFonts w:ascii="Consolas" w:hAnsi="Consolas"/>
+        </w:rPr>
+        <w:t xml:space="preserve">AWS_ACCESS_KEY_ID</w:t>
+      </w:r>
+    </w:p>
+    <w:p>
+      <w:pPr>
+        <w:ind w:left="720" w:hanging="360"/>
+      </w:pPr>
+      <w:r>
+        <w:t xml:space="preserve">• </w:t>
+      </w:r>
+      <w:r>
+        <w:rPr>
+          <w:rFonts w:ascii="Consolas" w:hAnsi="Consolas"/>
+        </w:rPr>
+        <w:t xml:space="preserve">AWS_SECRET_ACCESS_KEY</w:t>
+      </w:r>
+    </w:p>
+    <w:p>
+      <w:pPr>
+        <w:ind w:left="720" w:hanging="360"/>
+      </w:pPr>
+      <w:r>
+        <w:t xml:space="preserve">• </w:t>
+      </w:r>
+      <w:r>
+        <w:rPr>
+          <w:rFonts w:ascii="Consolas" w:hAnsi="Consolas"/>
+        </w:rPr>
+        <w:t xml:space="preserve">AWS_DEFAULT_REGION</w:t>
+      </w:r>
+    </w:p>
+    <w:p>
+      <w:r>
+        <w:t xml:space="preserve">When </w:t>
+      </w:r>
+      <w:r>
+        <w:rPr>
+          <w:rFonts w:ascii="Consolas" w:hAnsi="Consolas"/>
+        </w:rPr>
+        <w:t xml:space="preserve">-Cloud AWS</w:t>
+      </w:r>
+      <w:r>
+        <w:t xml:space="preserve">, </w:t>
+      </w:r>
+      <w:r>
+        <w:rPr>
+          <w:rFonts w:ascii="Consolas" w:hAnsi="Consolas"/>
+        </w:rPr>
+        <w:t xml:space="preserve">AWS_SESSION_TOKEN</w:t>
+      </w:r>
+      <w:r>
+        <w:t xml:space="preserve"> is also passed through if it exists on the host.</w:t>
+      </w:r>
+    </w:p>
+    <w:p>
+      <w:r>
+        <w:t xml:space="preserve">When </w:t>
       </w:r>
       <w:r>
         <w:rPr>
@@ -207,16 +799,7 @@
         <w:t xml:space="preserve">init.ps1</w:t>
       </w:r>
       <w:r>
-        <w:t xml:space="preserve"> is invoked, </w:t>
-      </w:r>
-      <w:r>
-        <w:rPr>
-          <w:rFonts w:ascii="Consolas" w:hAnsi="Consolas"/>
-        </w:rPr>
-        <w:t xml:space="preserve">run.ps1</w:t>
-      </w:r>
-      <w:r>
-        <w:t xml:space="preserve"> copies the top-level </w:t>
+        <w:t xml:space="preserve"> is invoked, it copies the top-level </w:t>
       </w:r>
       <w:r>
         <w:rPr>
@@ -253,175 +836,6 @@
       </w:r>
       <w:r>
         <w:t xml:space="preserve"> are skipped. This provides Dockerfile-like override behavior without rebuilding the base image.</w:t>
-      </w:r>
-    </w:p>
-    <w:p>
-      <w:r>
-        <w:rPr>
-          <w:rFonts w:ascii="Consolas" w:hAnsi="Consolas"/>
-        </w:rPr>
-        <w:t xml:space="preserve">run.ps1</w:t>
-      </w:r>
-      <w:r>
-        <w:t xml:space="preserve"> passes selected host environment variables through to the container based on </w:t>
-      </w:r>
-      <w:r>
-        <w:rPr>
-          <w:rFonts w:ascii="Consolas" w:hAnsi="Consolas"/>
-        </w:rPr>
-        <w:t xml:space="preserve">-Cloud</w:t>
-      </w:r>
-      <w:r>
-        <w:t xml:space="preserve">.</w:t>
-      </w:r>
-    </w:p>
-    <w:p>
-      <w:r>
-        <w:t xml:space="preserve">When </w:t>
-      </w:r>
-      <w:r>
-        <w:rPr>
-          <w:rFonts w:ascii="Consolas" w:hAnsi="Consolas"/>
-        </w:rPr>
-        <w:t xml:space="preserve">-Cloud Azure</w:t>
-      </w:r>
-      <w:r>
-        <w:t xml:space="preserve">, these host environment variables must exist:</w:t>
-      </w:r>
-    </w:p>
-    <w:p>
-      <w:pPr>
-        <w:ind w:left="720" w:hanging="360"/>
-      </w:pPr>
-      <w:r>
-        <w:t xml:space="preserve">• </w:t>
-      </w:r>
-      <w:r>
-        <w:rPr>
-          <w:rFonts w:ascii="Consolas" w:hAnsi="Consolas"/>
-        </w:rPr>
-        <w:t xml:space="preserve">AZURE_TENANT_ID</w:t>
-      </w:r>
-    </w:p>
-    <w:p>
-      <w:pPr>
-        <w:ind w:left="720" w:hanging="360"/>
-      </w:pPr>
-      <w:r>
-        <w:t xml:space="preserve">• </w:t>
-      </w:r>
-      <w:r>
-        <w:rPr>
-          <w:rFonts w:ascii="Consolas" w:hAnsi="Consolas"/>
-        </w:rPr>
-        <w:t xml:space="preserve">AZURE_CLIENT_ID</w:t>
-      </w:r>
-    </w:p>
-    <w:p>
-      <w:pPr>
-        <w:ind w:left="720" w:hanging="360"/>
-      </w:pPr>
-      <w:r>
-        <w:t xml:space="preserve">• </w:t>
-      </w:r>
-      <w:r>
-        <w:rPr>
-          <w:rFonts w:ascii="Consolas" w:hAnsi="Consolas"/>
-        </w:rPr>
-        <w:t xml:space="preserve">AZURE_CLIENT_SECRET</w:t>
-      </w:r>
-    </w:p>
-    <w:p>
-      <w:pPr>
-        <w:ind w:left="720" w:hanging="360"/>
-      </w:pPr>
-      <w:r>
-        <w:t xml:space="preserve">• </w:t>
-      </w:r>
-      <w:r>
-        <w:rPr>
-          <w:rFonts w:ascii="Consolas" w:hAnsi="Consolas"/>
-        </w:rPr>
-        <w:t xml:space="preserve">AZURE_LOCATION</w:t>
-      </w:r>
-    </w:p>
-    <w:p>
-      <w:r>
-        <w:t xml:space="preserve">When </w:t>
-      </w:r>
-      <w:r>
-        <w:rPr>
-          <w:rFonts w:ascii="Consolas" w:hAnsi="Consolas"/>
-        </w:rPr>
-        <w:t xml:space="preserve">-Cloud AWS</w:t>
-      </w:r>
-      <w:r>
-        <w:t xml:space="preserve">, these host environment variables must exist:</w:t>
-      </w:r>
-    </w:p>
-    <w:p>
-      <w:pPr>
-        <w:ind w:left="720" w:hanging="360"/>
-      </w:pPr>
-      <w:r>
-        <w:t xml:space="preserve">• </w:t>
-      </w:r>
-      <w:r>
-        <w:rPr>
-          <w:rFonts w:ascii="Consolas" w:hAnsi="Consolas"/>
-        </w:rPr>
-        <w:t xml:space="preserve">AWS_ACCESS_KEY_ID</w:t>
-      </w:r>
-    </w:p>
-    <w:p>
-      <w:pPr>
-        <w:ind w:left="720" w:hanging="360"/>
-      </w:pPr>
-      <w:r>
-        <w:t xml:space="preserve">• </w:t>
-      </w:r>
-      <w:r>
-        <w:rPr>
-          <w:rFonts w:ascii="Consolas" w:hAnsi="Consolas"/>
-        </w:rPr>
-        <w:t xml:space="preserve">AWS_SECRET_ACCESS_KEY</w:t>
-      </w:r>
-    </w:p>
-    <w:p>
-      <w:pPr>
-        <w:ind w:left="720" w:hanging="360"/>
-      </w:pPr>
-      <w:r>
-        <w:t xml:space="preserve">• </w:t>
-      </w:r>
-      <w:r>
-        <w:rPr>
-          <w:rFonts w:ascii="Consolas" w:hAnsi="Consolas"/>
-        </w:rPr>
-        <w:t xml:space="preserve">AWS_DEFAULT_REGION</w:t>
-      </w:r>
-    </w:p>
-    <w:p>
-      <w:r>
-        <w:t xml:space="preserve">When </w:t>
-      </w:r>
-      <w:r>
-        <w:rPr>
-          <w:rFonts w:ascii="Consolas" w:hAnsi="Consolas"/>
-        </w:rPr>
-        <w:t xml:space="preserve">-Cloud AWS</w:t>
-      </w:r>
-      <w:r>
-        <w:t xml:space="preserve">, </w:t>
-      </w:r>
-      <w:r>
-        <w:rPr>
-          <w:rFonts w:ascii="Consolas" w:hAnsi="Consolas"/>
-        </w:rPr>
-        <w:t xml:space="preserve">AWS_SESSION_TOKEN</w:t>
-      </w:r>
-      <w:r>
-        <w:t xml:space="preserve"> is also passed through if it exists on the host.</w:t>
       </w:r>
     </w:p>
     <w:p>

</xml_diff>